<commit_message>
docs: actualizar participantes a Lucia Garrido Chocarro y Hugo Perez Muñoz
</commit_message>
<xml_diff>
--- a/Plantila para proyectos EIS Albarregas.docx
+++ b/Plantila para proyectos EIS Albarregas.docx
@@ -3506,23 +3506,19 @@
       <w:pPr>
         <w:spacing w:before="0" w:after="120" w:line="276" w:lineRule="auto"/>
       </w:pPr>
-      <w:r>
-        <w:rPr>
-          <w:rFonts w:ascii="Calibri" w:hAnsi="Calibri"/>
-          <w:b/>
-          <w:color w:val="262626"/>
-          <w:sz w:val="22"/>
+      <w:r/>
+      <w:r>
+        <w:rPr>
+          <w:rFonts w:ascii="Calibri" w:hAnsi="Calibri"/>
+          <w:b/>
         </w:rPr>
         <w:t xml:space="preserve">Participantes: </w:t>
       </w:r>
       <w:r>
         <w:rPr>
           <w:rFonts w:ascii="Calibri" w:hAnsi="Calibri"/>
-          <w:i w:val="0"/>
-          <w:color w:val="262626"/>
-          <w:sz w:val="22"/>
-        </w:rPr>
-        <w:t>Lucía Garrido (Coordinación de Proyecto, Product Owner y Desarrollo Frontend Móvil PWA / Accesibilidad). Equipo de desarrollo del Ciclo Formativo de Grado Superior DAM.</w:t>
+        </w:rPr>
+        <w:t>Lucía Garrido Chocarro (Product Owner, Diseño UI/UX y Desarrollo Frontend Móvil PWA) y Hugo Pérez Muñoz (Arquitectura Backend FastAPI, Base de Datos PostgreSQL, Pipeline OCR/IA y Panel Web Gestoría). Alumnos del C.F.G.S. en Desarrollo de Aplicaciones Multiplataforma (DAM).</w:t>
       </w:r>
     </w:p>
     <w:p>

</xml_diff>